<commit_message>
Tell users they can supply a newer ESTO file themselves
The guide said not to, and to wait for a new version of the tools. That
was true this morning; it is not now. Both tools re-derive their
comparison rows from a supplied table, so a colleague can move to a new
ESTO issue on their own.

Written in consequences rather than mechanism: the base year moves
automatically because it is read from the file, the first run against a
given file is slower while the rows are rebuilt, and the 9th Outlook
projections are unaffected because they follow their own cycle. Waiting
for a new release is still offered, since some users will prefer it.

Co-Authored-By: Claude Opus 5 <noreply@anthropic.com>
</commit_message>
<xml_diff>
--- a/docs/docx/leap_review_tools_user_guide.docx
+++ b/docs/docx/leap_review_tools_user_guide.docx
@@ -2165,37 +2165,84 @@
           <w:b/>
           <w:bCs/>
         </w:rPr>
-        <w:t xml:space="preserve">When a new issue comes out, you will be sent a new version of the tools.</w:t>
-      </w:r>
-      <w:r>
-        <w:t xml:space="preserve"> </w:t>
-      </w:r>
-      <w:r>
-        <w:t xml:space="preserve">Please do not try to update the reference data yourself. The comparison depends on</w:t>
-      </w:r>
-      <w:r>
-        <w:t xml:space="preserve"> </w:t>
-      </w:r>
-      <w:r>
-        <w:t xml:space="preserve">several files that are prepared together and have to match each other; replacing</w:t>
-      </w:r>
-      <w:r>
-        <w:t xml:space="preserve"> </w:t>
-      </w:r>
-      <w:r>
-        <w:t xml:space="preserve">one of them on its own leaves the rest out of step, and the tools would carry on</w:t>
-      </w:r>
-      <w:r>
-        <w:t xml:space="preserve"> </w:t>
-      </w:r>
-      <w:r>
-        <w:t xml:space="preserve">running and quietly give you answers based on a mixture of old and new. Your</w:t>
-      </w:r>
-      <w:r>
-        <w:t xml:space="preserve"> </w:t>
-      </w:r>
-      <w:r>
-        <w:t xml:space="preserve">modelling team rebuilds and reissues the whole set so that cannot happen.</w:t>
+        <w:t xml:space="preserve">You can use a newer ESTO file without waiting for a new version of the tools.</w:t>
+      </w:r>
+      <w:r>
+        <w:t xml:space="preserve"> </w:t>
+      </w:r>
+      <w:r>
+        <w:t xml:space="preserve">Point either command at it:</w:t>
+      </w:r>
+    </w:p>
+    <w:p>
+      <w:pPr>
+        <w:pStyle w:val="SourceCode"/>
+      </w:pPr>
+      <w:r>
+        <w:rPr>
+          <w:rStyle w:val="VerbatimChar"/>
+        </w:rPr>
+        <w:t xml:space="preserve">.\leap-review-tools.exe dashboard-from-export --economy 20_USA --esto-table-path "input\00APEC_2026_low_with_subtotals.csv"</w:t>
+      </w:r>
+    </w:p>
+    <w:p>
+      <w:pPr>
+        <w:pStyle w:val="FirstParagraph"/>
+      </w:pPr>
+      <w:r>
+        <w:t xml:space="preserve">Both tools then use your file, and the base year moves with it automatically —</w:t>
+      </w:r>
+      <w:r>
+        <w:t xml:space="preserve"> </w:t>
+      </w:r>
+      <w:r>
+        <w:t xml:space="preserve">the tools read it from the file rather than being told. The comparison rows are</w:t>
+      </w:r>
+      <w:r>
+        <w:t xml:space="preserve"> </w:t>
+      </w:r>
+      <w:r>
+        <w:t xml:space="preserve">rebuilt from your data the first time you use a given file, which adds a couple</w:t>
+      </w:r>
+      <w:r>
+        <w:t xml:space="preserve"> </w:t>
+      </w:r>
+      <w:r>
+        <w:t xml:space="preserve">of minutes; after that it is remembered.</w:t>
+      </w:r>
+    </w:p>
+    <w:p>
+      <w:pPr>
+        <w:pStyle w:val="BodyText"/>
+      </w:pPr>
+      <w:r>
+        <w:t xml:space="preserve">Two things worth knowing. The 9th Outlook projections are on their own release</w:t>
+      </w:r>
+      <w:r>
+        <w:t xml:space="preserve"> </w:t>
+      </w:r>
+      <w:r>
+        <w:t xml:space="preserve">cycle, so an ESTO update does not change them. And each run records which file it</w:t>
+      </w:r>
+      <w:r>
+        <w:t xml:space="preserve"> </w:t>
+      </w:r>
+      <w:r>
+        <w:t xml:space="preserve">used, so a result can always be traced back to the data behind it.</w:t>
+      </w:r>
+    </w:p>
+    <w:p>
+      <w:pPr>
+        <w:pStyle w:val="BodyText"/>
+      </w:pPr>
+      <w:r>
+        <w:t xml:space="preserve">If you would rather not manage this yourself, that is fine too: your modelling</w:t>
+      </w:r>
+      <w:r>
+        <w:t xml:space="preserve"> </w:t>
+      </w:r>
+      <w:r>
+        <w:t xml:space="preserve">team will send a new version of the tools with the newer data already in it.</w:t>
       </w:r>
     </w:p>
     <w:bookmarkStart w:id="31" w:name="please-never-edit-the-reference-data"/>

</xml_diff>